<commit_message>
modified:   worksheet-p8/8._Worksheet_PABW_Pertemuan8_-_ID_(terisi).docx 	modified:   worksheet-p8/~$_Worksheet_PABW_Pertemuan8_-_ID_(terisi).docx 	deleted:    worksheet-p8/~WRL0003.tmp
</commit_message>
<xml_diff>
--- a/worksheet-p8/8._Worksheet_PABW_Pertemuan8_-_ID_(terisi).docx
+++ b/worksheet-p8/8._Worksheet_PABW_Pertemuan8_-_ID_(terisi).docx
@@ -4286,8 +4286,17 @@
                 <w:rFonts w:cs="Carlito"/>
                 <w:sz w:val="18"/>
               </w:rPr>
-              <w:t xml:space="preserve"> Fabian S</w:t>
-            </w:r>
+              <w:t xml:space="preserve"> </w:t>
+            </w:r>
+            <w:proofErr w:type="spellStart"/>
+            <w:r>
+              <w:rPr>
+                <w:rFonts w:cs="Carlito"/>
+                <w:sz w:val="18"/>
+              </w:rPr>
+              <w:t>Fabbi</w:t>
+            </w:r>
+            <w:proofErr w:type="spellEnd"/>
           </w:p>
         </w:tc>
         <w:tc>
@@ -5387,14 +5396,6 @@
             <w:pPr>
               <w:spacing w:before="20" w:after="20" w:line="252" w:lineRule="auto"/>
             </w:pPr>
-            <w:proofErr w:type="spellStart"/>
-            <w:r>
-              <w:t>Rizky</w:t>
-            </w:r>
-            <w:proofErr w:type="spellEnd"/>
-            <w:r>
-              <w:t xml:space="preserve"> Fabian s</w:t>
-            </w:r>
           </w:p>
         </w:tc>
       </w:tr>
@@ -5542,17 +5543,6 @@
             <w:pPr>
               <w:spacing w:before="20" w:after="20" w:line="252" w:lineRule="auto"/>
             </w:pPr>
-            <w:r>
-              <w:t xml:space="preserve">["HTML", "CSS", "JavaScript", "Git &amp; GitHub", "Desain </w:t>
-            </w:r>
-            <w:proofErr w:type="spellStart"/>
-            <w:r>
-              <w:t>Responsif</w:t>
-            </w:r>
-            <w:proofErr w:type="spellEnd"/>
-            <w:r>
-              <w:t>"]</w:t>
-            </w:r>
           </w:p>
         </w:tc>
       </w:tr>
@@ -12987,18 +12977,128 @@
         </w:tc>
       </w:tr>
     </w:tbl>
-    <w:p/>
     <w:p>
+      <w:r>
+        <w:rPr>
+          <w:noProof/>
+        </w:rPr>
+        <w:drawing>
+          <wp:inline distT="0" distB="0" distL="0" distR="0" wp14:anchorId="42AD6A83" wp14:editId="6DCCAF9D">
+            <wp:extent cx="3771726" cy="1471353"/>
+            <wp:effectExtent l="0" t="0" r="635" b="0"/>
+            <wp:docPr id="1" name="Picture 1"/>
+            <wp:cNvGraphicFramePr>
+              <a:graphicFrameLocks xmlns:a="http://schemas.openxmlformats.org/drawingml/2006/main" noChangeAspect="1"/>
+            </wp:cNvGraphicFramePr>
+            <a:graphic xmlns:a="http://schemas.openxmlformats.org/drawingml/2006/main">
+              <a:graphicData uri="http://schemas.openxmlformats.org/drawingml/2006/picture">
+                <pic:pic xmlns:pic="http://schemas.openxmlformats.org/drawingml/2006/picture">
+                  <pic:nvPicPr>
+                    <pic:cNvPr id="1" name="Picture 1"/>
+                    <pic:cNvPicPr/>
+                  </pic:nvPicPr>
+                  <pic:blipFill>
+                    <a:blip r:embed="rId8"/>
+                    <a:stretch>
+                      <a:fillRect/>
+                    </a:stretch>
+                  </pic:blipFill>
+                  <pic:spPr>
+                    <a:xfrm>
+                      <a:off x="0" y="0"/>
+                      <a:ext cx="3771726" cy="1471353"/>
+                    </a:xfrm>
+                    <a:prstGeom prst="rect">
+                      <a:avLst/>
+                    </a:prstGeom>
+                  </pic:spPr>
+                </pic:pic>
+              </a:graphicData>
+            </a:graphic>
+          </wp:inline>
+        </w:drawing>
+      </w:r>
+    </w:p>
+    <w:p>
+      <w:proofErr w:type="spellStart"/>
       <w:r>
         <w:rPr>
           <w:i/>
           <w:color w:val="555555"/>
           <w:sz w:val="17"/>
         </w:rPr>
-        <w:t>Tangkapan 1 — galat muncul (halaman dibuka lewat file://)</w:t>
+        <w:t>Tangkapan</w:t>
+      </w:r>
+      <w:proofErr w:type="spellEnd"/>
+      <w:r>
+        <w:rPr>
+          <w:i/>
+          <w:color w:val="555555"/>
+          <w:sz w:val="17"/>
+        </w:rPr>
+        <w:t xml:space="preserve"> 1 — </w:t>
+      </w:r>
+      <w:proofErr w:type="spellStart"/>
+      <w:r>
+        <w:rPr>
+          <w:i/>
+          <w:color w:val="555555"/>
+          <w:sz w:val="17"/>
+        </w:rPr>
+        <w:t>galat</w:t>
+      </w:r>
+      <w:proofErr w:type="spellEnd"/>
+      <w:r>
+        <w:rPr>
+          <w:i/>
+          <w:color w:val="555555"/>
+          <w:sz w:val="17"/>
+        </w:rPr>
+        <w:t xml:space="preserve"> muncul (halaman dibuka lewat file://)</w:t>
       </w:r>
     </w:p>
-    <w:p/>
+    <w:p>
+      <w:r>
+        <w:rPr>
+          <w:noProof/>
+        </w:rPr>
+        <w:drawing>
+          <wp:inline distT="0" distB="0" distL="0" distR="0" wp14:anchorId="3C8859CF" wp14:editId="0DE134F2">
+            <wp:extent cx="5394960" cy="963486"/>
+            <wp:effectExtent l="0" t="0" r="0" b="8255"/>
+            <wp:docPr id="2" name="Picture 2"/>
+            <wp:cNvGraphicFramePr>
+              <a:graphicFrameLocks xmlns:a="http://schemas.openxmlformats.org/drawingml/2006/main" noChangeAspect="1"/>
+            </wp:cNvGraphicFramePr>
+            <a:graphic xmlns:a="http://schemas.openxmlformats.org/drawingml/2006/main">
+              <a:graphicData uri="http://schemas.openxmlformats.org/drawingml/2006/picture">
+                <pic:pic xmlns:pic="http://schemas.openxmlformats.org/drawingml/2006/picture">
+                  <pic:nvPicPr>
+                    <pic:cNvPr id="2" name="Picture 2"/>
+                    <pic:cNvPicPr/>
+                  </pic:nvPicPr>
+                  <pic:blipFill>
+                    <a:blip r:embed="rId9"/>
+                    <a:stretch>
+                      <a:fillRect/>
+                    </a:stretch>
+                  </pic:blipFill>
+                  <pic:spPr>
+                    <a:xfrm>
+                      <a:off x="0" y="0"/>
+                      <a:ext cx="5394960" cy="963486"/>
+                    </a:xfrm>
+                    <a:prstGeom prst="rect">
+                      <a:avLst/>
+                    </a:prstGeom>
+                  </pic:spPr>
+                </pic:pic>
+              </a:graphicData>
+            </a:graphic>
+          </wp:inline>
+        </w:drawing>
+      </w:r>
+    </w:p>
     <w:p>
       <w:r>
         <w:rPr>
@@ -13009,7 +13109,49 @@
         <w:t>Tangkapan 2 — setelah diperbaiki (lewat http://, Console bersih)</w:t>
       </w:r>
     </w:p>
-    <w:p/>
+    <w:p>
+      <w:r>
+        <w:rPr>
+          <w:noProof/>
+        </w:rPr>
+        <w:lastRenderedPageBreak/>
+        <w:drawing>
+          <wp:inline distT="0" distB="0" distL="0" distR="0" wp14:anchorId="160BE799" wp14:editId="0EF2E46A">
+            <wp:extent cx="5394960" cy="1504390"/>
+            <wp:effectExtent l="0" t="0" r="0" b="635"/>
+            <wp:docPr id="3" name="Picture 3"/>
+            <wp:cNvGraphicFramePr>
+              <a:graphicFrameLocks xmlns:a="http://schemas.openxmlformats.org/drawingml/2006/main" noChangeAspect="1"/>
+            </wp:cNvGraphicFramePr>
+            <a:graphic xmlns:a="http://schemas.openxmlformats.org/drawingml/2006/main">
+              <a:graphicData uri="http://schemas.openxmlformats.org/drawingml/2006/picture">
+                <pic:pic xmlns:pic="http://schemas.openxmlformats.org/drawingml/2006/picture">
+                  <pic:nvPicPr>
+                    <pic:cNvPr id="3" name="Picture 3"/>
+                    <pic:cNvPicPr/>
+                  </pic:nvPicPr>
+                  <pic:blipFill>
+                    <a:blip r:embed="rId10"/>
+                    <a:stretch>
+                      <a:fillRect/>
+                    </a:stretch>
+                  </pic:blipFill>
+                  <pic:spPr>
+                    <a:xfrm>
+                      <a:off x="0" y="0"/>
+                      <a:ext cx="5394960" cy="1504390"/>
+                    </a:xfrm>
+                    <a:prstGeom prst="rect">
+                      <a:avLst/>
+                    </a:prstGeom>
+                  </pic:spPr>
+                </pic:pic>
+              </a:graphicData>
+            </a:graphic>
+          </wp:inline>
+        </w:drawing>
+      </w:r>
+    </w:p>
     <w:p>
       <w:r>
         <w:rPr>
@@ -13204,7 +13346,6 @@
           <w:color w:val="5A6080"/>
           <w:sz w:val="17"/>
         </w:rPr>
-        <w:lastRenderedPageBreak/>
         <w:t>E — simpan perubahan</w:t>
       </w:r>
     </w:p>
@@ -18822,7 +18963,7 @@
       </w:pPr>
     </w:p>
     <w:sectPr>
-      <w:footerReference w:type="default" r:id="rId8"/>
+      <w:footerReference w:type="default" r:id="rId11"/>
       <w:pgSz w:w="11906" w:h="16838"/>
       <w:pgMar w:top="964" w:right="1077" w:bottom="907" w:left="1077" w:header="720" w:footer="720" w:gutter="0"/>
       <w:cols w:space="720"/>

</xml_diff>

<commit_message>
P8 — periksa, lalu simpan 	modified:   worksheet-p8/8._Worksheet_PABW_Pertemuan8_-_ID_(terisi).docx 	modified:   worksheet-p8/worksheet-p8/README.md
</commit_message>
<xml_diff>
--- a/worksheet-p8/8._Worksheet_PABW_Pertemuan8_-_ID_(terisi).docx
+++ b/worksheet-p8/8._Worksheet_PABW_Pertemuan8_-_ID_(terisi).docx
@@ -509,14 +509,17 @@
                 <w:rFonts w:cs="Carlito"/>
                 <w:sz w:val="19"/>
               </w:rPr>
-              <w:t>1. JavaScript terhubung ke halaman dan berjalan tanp</w:t>
+              <w:t>1. JavaScript terhubung ke halaman dan berjalan tanpa galat di Console.</w:t>
+            </w:r>
+            <w:r>
+              <w:br/>
             </w:r>
             <w:r>
               <w:rPr>
                 <w:rFonts w:cs="Carlito"/>
                 <w:sz w:val="19"/>
               </w:rPr>
-              <w:t>a galat di Console.</w:t>
+              <w:t>2. Data halaman (identitas, keahlian, daftar proyek) tersimpan sebagai variabel, objek, dan array — bukan sebagai teks di dalam HTML.</w:t>
             </w:r>
             <w:r>
               <w:br/>
@@ -526,7 +529,7 @@
                 <w:rFonts w:cs="Carlito"/>
                 <w:sz w:val="19"/>
               </w:rPr>
-              <w:t>2. Data halaman (identitas, keahlian, daftar proyek) tersimpan sebagai variabel, objek, dan array — bukan sebagai teks di dalam HTML.</w:t>
+              <w:t>3. Minimal dua fungsi murni bekerja dan hasilnya bisa dilihat.</w:t>
             </w:r>
             <w:r>
               <w:br/>
@@ -536,24 +539,7 @@
                 <w:rFonts w:cs="Carlito"/>
                 <w:sz w:val="19"/>
               </w:rPr>
-              <w:t>3. Minimal dua fungsi murni bekerja dan hasilnya bisa dilihat.</w:t>
-            </w:r>
-            <w:r>
-              <w:br/>
-            </w:r>
-            <w:r>
-              <w:rPr>
-                <w:rFonts w:cs="Carlito"/>
-                <w:sz w:val="19"/>
-              </w:rPr>
-              <w:t xml:space="preserve">4. Array methods map, filter, dan find </w:t>
-            </w:r>
-            <w:r>
-              <w:rPr>
-                <w:rFonts w:cs="Carlito"/>
-                <w:sz w:val="19"/>
-              </w:rPr>
-              <w:t>dipakai pada data yang benar.</w:t>
+              <w:t>4. Array methods map, filter, dan find dipakai pada data yang benar.</w:t>
             </w:r>
             <w:r>
               <w:br/>
@@ -866,14 +852,7 @@
                 <w:rFonts w:cs="Carlito"/>
                 <w:sz w:val="19"/>
               </w:rPr>
-              <w:t>90 menit di kelas. Bila belum selesai, dilanjutkan di luar kel</w:t>
-            </w:r>
-            <w:r>
-              <w:rPr>
-                <w:rFonts w:cs="Carlito"/>
-                <w:sz w:val="19"/>
-              </w:rPr>
-              <w:t>as paling lambat pukul 23.59 pada hari yang sama.</w:t>
+              <w:t>90 menit di kelas. Bila belum selesai, dilanjutkan di luar kelas paling lambat pukul 23.59 pada hari yang sama.</w:t>
             </w:r>
           </w:p>
         </w:tc>
@@ -1071,16 +1050,7 @@
                 <w:color w:val="FFFFFF"/>
                 <w:sz w:val="18"/>
               </w:rPr>
-              <w:t xml:space="preserve">Kalau waktu habis, berhenti di </w:t>
-            </w:r>
-            <w:r>
-              <w:rPr>
-                <w:rFonts w:cs="Carlito"/>
-                <w:b/>
-                <w:color w:val="FFFFFF"/>
-                <w:sz w:val="18"/>
-              </w:rPr>
-              <w:t>sini</w:t>
+              <w:t>Kalau waktu habis, berhenti di sini</w:t>
             </w:r>
           </w:p>
         </w:tc>
@@ -1377,14 +1347,7 @@
                 <w:rFonts w:cs="Carlito"/>
                 <w:sz w:val="18"/>
               </w:rPr>
-              <w:t xml:space="preserve">Dua fungsi bekerja dan hasilnya terlihat di </w:t>
-            </w:r>
-            <w:r>
-              <w:rPr>
-                <w:rFonts w:cs="Carlito"/>
-                <w:sz w:val="18"/>
-              </w:rPr>
-              <w:t>Console</w:t>
+              <w:t>Dua fungsi bekerja dan hasilnya terlihat di Console</w:t>
             </w:r>
           </w:p>
         </w:tc>
@@ -1725,16 +1688,7 @@
                 <w:sz w:val="20"/>
               </w:rPr>
               <w:lastRenderedPageBreak/>
-              <w:t>Selalu kerjakan berurutan.  Setiap lembar mengandaikan lembar sebe</w:t>
-            </w:r>
-            <w:r>
-              <w:rPr>
-                <w:rFonts w:cs="Carlito"/>
-                <w:b/>
-                <w:color w:val="003796"/>
-                <w:sz w:val="20"/>
-              </w:rPr>
-              <w:t>lumnya sudah selesai. Kalau Anda melompat, galat yang muncul akan sulit dilacak karena sebabnya ada di lembar yang belum Anda kerjakan. Kolom paling kanan bukan batas waktu — hanya penunjuk laju.</w:t>
+              <w:t>Selalu kerjakan berurutan.  Setiap lembar mengandaikan lembar sebelumnya sudah selesai. Kalau Anda melompat, galat yang muncul akan sulit dilacak karena sebabnya ada di lembar yang belum Anda kerjakan. Kolom paling kanan bukan batas waktu — hanya penunjuk laju.</w:t>
             </w:r>
           </w:p>
         </w:tc>
@@ -1929,15 +1883,7 @@
           <w:b/>
           <w:color w:val="003796"/>
         </w:rPr>
-        <w:t>A.1  Pra</w:t>
-      </w:r>
-      <w:r>
-        <w:rPr>
-          <w:rFonts w:cs="Carlito"/>
-          <w:b/>
-          <w:color w:val="003796"/>
-        </w:rPr>
-        <w:t>syarat: halaman harus dibuka lewat server lokal</w:t>
+        <w:t>A.1  Prasyarat: halaman harus dibuka lewat server lokal</w:t>
       </w:r>
     </w:p>
     <w:p>
@@ -1946,14 +1892,7 @@
           <w:rFonts w:cs="Carlito"/>
           <w:sz w:val="20"/>
         </w:rPr>
-        <w:t>Berkas yang punya &lt;script type="module"&gt; tidak boleh dibuka dengan klik dua kali — peramban akan menolaknya karena alamatnya berawalan file://. Buka lewat salah satu cara berikut, dan pastikan yang terjadi: a</w:t>
-      </w:r>
-      <w:r>
-        <w:rPr>
-          <w:rFonts w:cs="Carlito"/>
-          <w:sz w:val="20"/>
-        </w:rPr>
-        <w:t>lamat di bilah peramban berawalan http://.</w:t>
+        <w:t>Berkas yang punya &lt;script type="module"&gt; tidak boleh dibuka dengan klik dua kali — peramban akan menolaknya karena alamatnya berawalan file://. Buka lewat salah satu cara berikut, dan pastikan yang terjadi: alamat di bilah peramban berawalan http://.</w:t>
       </w:r>
     </w:p>
     <w:tbl>
@@ -2245,16 +2184,7 @@
                 <w:color w:val="1B6B3A"/>
                 <w:sz w:val="20"/>
               </w:rPr>
-              <w:t>Halaman akan memuat ulang sendiri setiap kali Anda menyimpan berkas.  Itu bukan kerusakan —</w:t>
-            </w:r>
-            <w:r>
-              <w:rPr>
-                <w:rFonts w:cs="Carlito"/>
-                <w:b/>
-                <w:color w:val="1B6B3A"/>
-                <w:sz w:val="20"/>
-              </w:rPr>
-              <w:t xml:space="preserve"> itu memang perilaku Live Server. Tanpa itu, Anda harus menekan F5 sendiri setiap kali selesai menulis satu baris.</w:t>
+              <w:t>Halaman akan memuat ulang sendiri setiap kali Anda menyimpan berkas.  Itu bukan kerusakan — itu memang perilaku Live Server. Tanpa itu, Anda harus menekan F5 sendiri setiap kali selesai menulis satu baris.</w:t>
             </w:r>
           </w:p>
         </w:tc>
@@ -2285,14 +2215,7 @@
           <w:rFonts w:cs="Carlito"/>
           <w:sz w:val="20"/>
         </w:rPr>
-        <w:t>Tulis tepat satu baris &lt;script&gt; sebelum &lt;/body&gt;. Baris itu memuat tag pembuka dan ta</w:t>
-      </w:r>
-      <w:r>
-        <w:rPr>
-          <w:rFonts w:cs="Carlito"/>
-          <w:sz w:val="20"/>
-        </w:rPr>
-        <w:t>g penutup sekaligus; jangan menuliskannya dua kali. Atribut type="module" wajib ada, dan urutannya tidak boleh ditukar.</w:t>
+        <w:t>Tulis tepat satu baris &lt;script&gt; sebelum &lt;/body&gt;. Baris itu memuat tag pembuka dan tag penutup sekaligus; jangan menuliskannya dua kali. Atribut type="module" wajib ada, dan urutannya tidak boleh ditukar.</w:t>
       </w:r>
     </w:p>
     <w:tbl>
@@ -2606,14 +2529,7 @@
                 <w:rFonts w:cs="Carlito"/>
                 <w:sz w:val="18"/>
               </w:rPr>
-              <w:t>Menunjuk berkas skrip yang Anda tulis, relatif te</w:t>
-            </w:r>
-            <w:r>
-              <w:rPr>
-                <w:rFonts w:cs="Carlito"/>
-                <w:sz w:val="18"/>
-              </w:rPr>
-              <w:t>rhadap profil.html</w:t>
+              <w:t>Menunjuk berkas skrip yang Anda tulis, relatif terhadap profil.html</w:t>
             </w:r>
           </w:p>
         </w:tc>
@@ -2712,14 +2628,7 @@
                 <w:rFonts w:cs="Carlito"/>
                 <w:sz w:val="18"/>
               </w:rPr>
-              <w:t>Di dalam &lt;head&gt;, skrip berjalan sebelum elemen ada dan membaca nil</w:t>
-            </w:r>
-            <w:r>
-              <w:rPr>
-                <w:rFonts w:cs="Carlito"/>
-                <w:sz w:val="18"/>
-              </w:rPr>
-              <w:t>ai kosong</w:t>
+              <w:t>Di dalam &lt;head&gt;, skrip berjalan sebelum elemen ada dan membaca nilai kosong</w:t>
             </w:r>
           </w:p>
         </w:tc>
@@ -2819,16 +2728,7 @@
                 <w:color w:val="FFFFFF"/>
                 <w:sz w:val="19"/>
               </w:rPr>
-              <w:t>Tan</w:t>
-            </w:r>
-            <w:r>
-              <w:rPr>
-                <w:rFonts w:cs="Carlito"/>
-                <w:b/>
-                <w:color w:val="FFFFFF"/>
-                <w:sz w:val="19"/>
-              </w:rPr>
-              <w:t>da</w:t>
+              <w:t>Tanda</w:t>
             </w:r>
           </w:p>
         </w:tc>
@@ -3141,16 +3041,7 @@
                 <w:color w:val="003796"/>
                 <w:sz w:val="20"/>
               </w:rPr>
-              <w:t>Kalau halaman tampak biasa</w:t>
-            </w:r>
-            <w:r>
-              <w:rPr>
-                <w:rFonts w:cs="Carlito"/>
-                <w:b/>
-                <w:color w:val="003796"/>
-                <w:sz w:val="20"/>
-              </w:rPr>
-              <w:t xml:space="preserve"> saja padahal app.js kosong, itu tanda yang baik.  Artinya skrip tidak mengubah apa pun yang belum Anda tulis.</w:t>
+              <w:t>Kalau halaman tampak biasa saja padahal app.js kosong, itu tanda yang baik.  Artinya skrip tidak mengubah apa pun yang belum Anda tulis.</w:t>
             </w:r>
           </w:p>
         </w:tc>
@@ -3299,14 +3190,7 @@
           <w:rFonts w:cs="Carlito"/>
           <w:sz w:val="20"/>
         </w:rPr>
-        <w:t xml:space="preserve">Lembar A sudah selesai? Simpan hasilnya sekarang, jangan menunggu kelas berakhir. Simpanan ini tidak memerlukan langkah tambahan apa pun — hanya memastikan pekerjaan Anda tidak bergantung </w:t>
-      </w:r>
-      <w:r>
-        <w:rPr>
-          <w:rFonts w:cs="Carlito"/>
-          <w:sz w:val="20"/>
-        </w:rPr>
-        <w:t>pada satu berkas di satu komputer.</w:t>
+        <w:t>Lembar A sudah selesai? Simpan hasilnya sekarang, jangan menunggu kelas berakhir. Simpanan ini tidak memerlukan langkah tambahan apa pun — hanya memastikan pekerjaan Anda tidak bergantung pada satu berkas di satu komputer.</w:t>
       </w:r>
     </w:p>
     <w:p>
@@ -3503,14 +3387,7 @@
           <w:rFonts w:cs="Carlito"/>
           <w:sz w:val="20"/>
         </w:rPr>
-        <w:t>Sekarang pindahkan identitas halaman Anda dari HTML ke JavaScript. Yang dipindah hanya isinya; struktur HTML-nya tetap. Bila identitas itu muncul di dua tempat — misalnya di &lt;title&gt; dan di dalam &lt;header&gt; — cukup tulis sekali sebagai variabel, lalu pakai di</w:t>
-      </w:r>
-      <w:r>
-        <w:rPr>
-          <w:rFonts w:cs="Carlito"/>
-          <w:sz w:val="20"/>
-        </w:rPr>
-        <w:t xml:space="preserve"> kedua tempat. Di situlah gunanya.</w:t>
+        <w:t>Sekarang pindahkan identitas halaman Anda dari HTML ke JavaScript. Yang dipindah hanya isinya; struktur HTML-nya tetap. Bila identitas itu muncul di dua tempat — misalnya di &lt;title&gt; dan di dalam &lt;header&gt; — cukup tulis sekali sebagai variabel, lalu pakai di kedua tempat. Di situlah gunanya.</w:t>
       </w:r>
     </w:p>
     <w:p>
@@ -3538,14 +3415,7 @@
           <w:rFonts w:cs="Carlito"/>
           <w:sz w:val="20"/>
         </w:rPr>
-        <w:t>JavaScript punya dua cara menampung nilai, dan pilihannya bukan selera. Pakai const bila nilai itu tidak akan ditunjuk ulang; pakai let hanya bila Anda memang akan mengu</w:t>
-      </w:r>
-      <w:r>
-        <w:rPr>
-          <w:rFonts w:cs="Carlito"/>
-          <w:sz w:val="20"/>
-        </w:rPr>
-        <w:t>bahnya.</w:t>
+        <w:t>JavaScript punya dua cara menampung nilai, dan pilihannya bukan selera. Pakai const bila nilai itu tidak akan ditunjuk ulang; pakai let hanya bila Anda memang akan mengubahnya.</w:t>
       </w:r>
     </w:p>
     <w:tbl>
@@ -3955,15 +3825,7 @@
                 <w:color w:val="E2E8F0"/>
                 <w:sz w:val="17"/>
               </w:rPr>
-              <w:t>let pilihanAktif = "semua";   // akan berubah saat disari</w:t>
-            </w:r>
-            <w:r>
-              <w:rPr>
-                <w:rFonts w:ascii="DejaVu Sans Mono" w:eastAsia="DejaVu Sans Mono" w:hAnsi="DejaVu Sans Mono" w:cs="DejaVu Sans Mono"/>
-                <w:color w:val="E2E8F0"/>
-                <w:sz w:val="17"/>
-              </w:rPr>
-              <w:t>ng</w:t>
+              <w:t>let pilihanAktif = "semua";   // akan berubah saat disaring</w:t>
             </w:r>
             <w:r>
               <w:br/>
@@ -4635,14 +4497,7 @@
           <w:rFonts w:cs="Carlito"/>
           <w:sz w:val="20"/>
         </w:rPr>
-        <w:t>Keenam baris ini yang paling serin</w:t>
-      </w:r>
-      <w:r>
-        <w:rPr>
-          <w:rFonts w:cs="Carlito"/>
-          <w:sz w:val="20"/>
-        </w:rPr>
-        <w:t>g muncul di Console mahasiswa pada pertemuan ini. Bacalah sebelum menulis kode, bukan sesudah galat muncul.</w:t>
+        <w:t>Keenam baris ini yang paling sering muncul di Console mahasiswa pada pertemuan ini. Bacalah sebelum menulis kode, bukan sesudah galat muncul.</w:t>
       </w:r>
     </w:p>
     <w:tbl>
@@ -4889,14 +4744,7 @@
                 <w:rFonts w:cs="Carlito"/>
                 <w:sz w:val="18"/>
               </w:rPr>
-              <w:t>Pakai ?? bila Anda hanya ingin menang</w:t>
-            </w:r>
-            <w:r>
-              <w:rPr>
-                <w:rFonts w:cs="Carlito"/>
-                <w:sz w:val="18"/>
-              </w:rPr>
-              <w:t>kap null dan undefined</w:t>
+              <w:t>Pakai ?? bila Anda hanya ingin menangkap null dan undefined</w:t>
             </w:r>
           </w:p>
         </w:tc>
@@ -5177,14 +5025,7 @@
                 <w:rFonts w:cs="Carlito"/>
                 <w:sz w:val="18"/>
               </w:rPr>
-              <w:t>Nilai dari kolom</w:t>
-            </w:r>
-            <w:r>
-              <w:rPr>
-                <w:rFonts w:cs="Carlito"/>
-                <w:sz w:val="18"/>
-              </w:rPr>
-              <w:t xml:space="preserve"> isian selalu teks — hasilnya "101", bukan 101</w:t>
+              <w:t>Nilai dari kolom isian selalu teks — hasilnya "101", bukan 101</w:t>
             </w:r>
           </w:p>
         </w:tc>
@@ -5834,14 +5675,7 @@
           <w:rFonts w:cs="Carlito"/>
           <w:sz w:val="20"/>
         </w:rPr>
-        <w:t>Cara memasti</w:t>
-      </w:r>
-      <w:r>
-        <w:rPr>
-          <w:rFonts w:cs="Carlito"/>
-          <w:sz w:val="20"/>
-        </w:rPr>
-        <w:t>kan: buka Console dan panggil salah satu variabel Anda. Nilainya harus muncul, bukan undefined.</w:t>
+        <w:t>Cara memastikan: buka Console dan panggil salah satu variabel Anda. Nilainya harus muncul, bukan undefined.</w:t>
       </w:r>
     </w:p>
     <w:p>
@@ -6033,15 +5867,7 @@
           <w:b/>
           <w:color w:val="003796"/>
         </w:rPr>
-        <w:t xml:space="preserve">C.1  Tiga bentuk fungsi, satu </w:t>
-      </w:r>
-      <w:r>
-        <w:rPr>
-          <w:rFonts w:cs="Carlito"/>
-          <w:b/>
-          <w:color w:val="003796"/>
-        </w:rPr>
-        <w:t>kegunaan</w:t>
+        <w:t>C.1  Tiga bentuk fungsi, satu kegunaan</w:t>
       </w:r>
     </w:p>
     <w:p>
@@ -6221,14 +6047,7 @@
                 <w:rFonts w:cs="Carlito"/>
                 <w:sz w:val="18"/>
               </w:rPr>
-              <w:t>Paling mudah dibaca; boleh dipa</w:t>
-            </w:r>
-            <w:r>
-              <w:rPr>
-                <w:rFonts w:cs="Carlito"/>
-                <w:sz w:val="18"/>
-              </w:rPr>
-              <w:t>nggil sebelum barisnya ditulis</w:t>
+              <w:t>Paling mudah dibaca; boleh dipanggil sebelum barisnya ditulis</w:t>
             </w:r>
           </w:p>
         </w:tc>
@@ -6492,15 +6311,7 @@
                 <w:color w:val="E2E8F0"/>
                 <w:sz w:val="17"/>
               </w:rPr>
-              <w:t>// 2. Merapikan daft</w:t>
-            </w:r>
-            <w:r>
-              <w:rPr>
-                <w:rFonts w:ascii="DejaVu Sans Mono" w:eastAsia="DejaVu Sans Mono" w:hAnsi="DejaVu Sans Mono" w:cs="DejaVu Sans Mono"/>
-                <w:color w:val="E2E8F0"/>
-                <w:sz w:val="17"/>
-              </w:rPr>
-              <w:t>ar keahlian menjadi satu baris teks</w:t>
+              <w:t>// 2. Merapikan daftar keahlian menjadi satu baris teks</w:t>
             </w:r>
             <w:r>
               <w:br/>
@@ -6567,14 +6378,7 @@
           <w:rFonts w:cs="Carlito"/>
           <w:sz w:val="20"/>
         </w:rPr>
-        <w:t>Parameter adalah nama yang Anda pakai di dalam fungsi; argumen adalah nilai yang Anda kirim saat memanggilnya. Bila fungsi memerlukan lebih dari dua argumen, kirim satu objek saja — urutannya tidak lagi mudah</w:t>
-      </w:r>
-      <w:r>
-        <w:rPr>
-          <w:rFonts w:cs="Carlito"/>
-          <w:sz w:val="20"/>
-        </w:rPr>
-        <w:t xml:space="preserve"> tertukar.</w:t>
+        <w:t>Parameter adalah nama yang Anda pakai di dalam fungsi; argumen adalah nilai yang Anda kirim saat memanggilnya. Bila fungsi memerlukan lebih dari dua argumen, kirim satu objek saja — urutannya tidak lagi mudah tertukar.</w:t>
       </w:r>
     </w:p>
     <w:tbl>
@@ -6928,14 +6732,7 @@
           <w:rFonts w:cs="Carlito"/>
           <w:sz w:val="20"/>
         </w:rPr>
-        <w:t>Fungsi murni hanya berga</w:t>
-      </w:r>
-      <w:r>
-        <w:rPr>
-          <w:rFonts w:cs="Carlito"/>
-          <w:sz w:val="20"/>
-        </w:rPr>
-        <w:t>ntung pada argumennya dan tidak mengubah apa pun di luar dirinya. Praktisnya: fungsi yang sama, dengan argumen yang sama, selalu memberi hasil yang sama. Ini yang membuat kode Anda bisa diperiksa — oleh Anda sendiri, dua pekan kemudian.</w:t>
+        <w:t>Fungsi murni hanya bergantung pada argumennya dan tidak mengubah apa pun di luar dirinya. Praktisnya: fungsi yang sama, dengan argumen yang sama, selalu memberi hasil yang sama. Ini yang membuat kode Anda bisa diperiksa — oleh Anda sendiri, dua pekan kemudian.</w:t>
       </w:r>
     </w:p>
     <w:tbl>
@@ -7004,16 +6801,7 @@
                 <w:color w:val="FFFFFF"/>
                 <w:sz w:val="18"/>
               </w:rPr>
-              <w:t>Fungsi m</w:t>
-            </w:r>
-            <w:r>
-              <w:rPr>
-                <w:rFonts w:cs="Carlito"/>
-                <w:b/>
-                <w:color w:val="FFFFFF"/>
-                <w:sz w:val="18"/>
-              </w:rPr>
-              <w:t>urni</w:t>
+              <w:t>Fungsi murni</w:t>
             </w:r>
           </w:p>
         </w:tc>
@@ -7765,14 +7553,7 @@
                 <w:rFonts w:cs="Carlito"/>
                 <w:sz w:val="18"/>
               </w:rPr>
-              <w:t>Pecah sampai satu fungsi satu pekerj</w:t>
-            </w:r>
-            <w:r>
-              <w:rPr>
-                <w:rFonts w:cs="Carlito"/>
-                <w:sz w:val="18"/>
-              </w:rPr>
-              <w:t>aan</w:t>
+              <w:t>Pecah sampai satu fungsi satu pekerjaan</w:t>
             </w:r>
           </w:p>
         </w:tc>
@@ -8064,14 +7845,7 @@
           <w:rFonts w:cs="Carlito"/>
           <w:sz w:val="20"/>
         </w:rPr>
-        <w:t>Cara memasti</w:t>
-      </w:r>
-      <w:r>
-        <w:rPr>
-          <w:rFonts w:cs="Carlito"/>
-          <w:sz w:val="20"/>
-        </w:rPr>
-        <w:t>kan: panggil kedua fungsi Anda di Console dengan argumen berbeda. Hasilnya muncul dan sesuai dugaan Anda.</w:t>
+        <w:t>Cara memastikan: panggil kedua fungsi Anda di Console dengan argumen berbeda. Hasilnya muncul dan sesuai dugaan Anda.</w:t>
       </w:r>
     </w:p>
     <w:p>
@@ -8244,14 +8018,7 @@
           <w:rFonts w:cs="Carlito"/>
           <w:sz w:val="20"/>
         </w:rPr>
-        <w:t>Satu nilai sudah bisa ditampung variabel. Sekarang tempatkan seluruh isi halaman sebagai data: satu objek untuk identitas, satu array of object untuk daftar keahlian dan daftar</w:t>
-      </w:r>
-      <w:r>
-        <w:rPr>
-          <w:rFonts w:cs="Carlito"/>
-          <w:sz w:val="20"/>
-        </w:rPr>
-        <w:t xml:space="preserve"> proyek. Setelah ini Anda tidak lagi menyunting HTML untuk mengubah isi.</w:t>
+        <w:t>Satu nilai sudah bisa ditampung variabel. Sekarang tempatkan seluruh isi halaman sebagai data: satu objek untuk identitas, satu array of object untuk daftar keahlian dan daftar proyek. Setelah ini Anda tidak lagi menyunting HTML untuk mengubah isi.</w:t>
       </w:r>
     </w:p>
     <w:p>
@@ -8279,14 +8046,7 @@
           <w:rFonts w:cs="Carlito"/>
           <w:sz w:val="20"/>
         </w:rPr>
-        <w:t>Object menyimpan nilai berlabel; array menyimpan urutan. Daftar proyek Anda adalah array yang setiap isinya sebuah object — dan itulah bentuk yang pal</w:t>
-      </w:r>
-      <w:r>
-        <w:rPr>
-          <w:rFonts w:cs="Carlito"/>
-          <w:sz w:val="20"/>
-        </w:rPr>
-        <w:t>ing sering Anda temui di pekerjaan nyata.</w:t>
+        <w:t>Object menyimpan nilai berlabel; array menyimpan urutan. Daftar proyek Anda adalah array yang setiap isinya sebuah object — dan itulah bentuk yang paling sering Anda temui di pekerjaan nyata.</w:t>
       </w:r>
     </w:p>
     <w:tbl>
@@ -9216,14 +8976,7 @@
                 <w:rFonts w:cs="Carlito"/>
                 <w:sz w:val="18"/>
               </w:rPr>
-              <w:t>daftarProyek['</w:t>
-            </w:r>
-            <w:r>
-              <w:rPr>
-                <w:rFonts w:cs="Carlito"/>
-                <w:sz w:val="18"/>
-              </w:rPr>
-              <w:t>0']</w:t>
+              <w:t>daftarProyek['0']</w:t>
             </w:r>
           </w:p>
         </w:tc>
@@ -9300,14 +9053,7 @@
           <w:rFonts w:cs="Carlito"/>
           <w:sz w:val="20"/>
         </w:rPr>
-        <w:t>Ketiganya menerima satu fungsi sebagai argumen dan memanggilnya untuk setiap isi array. Yang membedakan adalah apa yang mereka kembalik</w:t>
-      </w:r>
-      <w:r>
-        <w:rPr>
-          <w:rFonts w:cs="Carlito"/>
-          <w:sz w:val="20"/>
-        </w:rPr>
-        <w:t>an.</w:t>
+        <w:t>Ketiganya menerima satu fungsi sebagai argumen dan memanggilnya untuk setiap isi array. Yang membedakan adalah apa yang mereka kembalikan.</w:t>
       </w:r>
     </w:p>
     <w:tbl>
@@ -9974,15 +9720,7 @@
           <w:b/>
           <w:color w:val="003796"/>
         </w:rPr>
-        <w:t>D.4  Isi tabel pemeriksaan dat</w:t>
-      </w:r>
-      <w:r>
-        <w:rPr>
-          <w:rFonts w:cs="Carlito"/>
-          <w:b/>
-          <w:color w:val="003796"/>
-        </w:rPr>
-        <w:t>a saya</w:t>
+        <w:t>D.4  Isi tabel pemeriksaan data saya</w:t>
       </w:r>
     </w:p>
     <w:p>
@@ -10644,14 +10382,7 @@
           <w:rFonts w:cs="Carlito"/>
           <w:sz w:val="20"/>
         </w:rPr>
-        <w:t>Cara memasti</w:t>
-      </w:r>
-      <w:r>
-        <w:rPr>
-          <w:rFonts w:cs="Carlito"/>
-          <w:sz w:val="20"/>
-        </w:rPr>
-        <w:t>kan: jalankan console.table pada data Anda, lalu bandingkan jumlah barisnya dengan jumlah isi array di berkas app.js.</w:t>
+        <w:t>Cara memastikan: jalankan console.table pada data Anda, lalu bandingkan jumlah barisnya dengan jumlah isi array di berkas app.js.</w:t>
       </w:r>
     </w:p>
     <w:p>
@@ -10824,14 +10555,7 @@
           <w:rFonts w:cs="Carlito"/>
           <w:sz w:val="20"/>
         </w:rPr>
-        <w:t xml:space="preserve">Mulai pertemuan ini kode Anda bisa gagal, dan itu bagian dari pekerjaan. Yang dinilai bukan keberhasilan menghindari galat, melainkan cara Anda membacanya. </w:t>
-      </w:r>
-      <w:r>
-        <w:rPr>
-          <w:rFonts w:cs="Carlito"/>
-          <w:sz w:val="20"/>
-        </w:rPr>
-        <w:t>Jangan menghapus baris sampai galatnya hilang tanpa tahu sebabnya.</w:t>
+        <w:t>Mulai pertemuan ini kode Anda bisa gagal, dan itu bagian dari pekerjaan. Yang dinilai bukan keberhasilan menghindari galat, melainkan cara Anda membacanya. Jangan menghapus baris sampai galatnya hilang tanpa tahu sebabnya.</w:t>
       </w:r>
     </w:p>
     <w:p>
@@ -10859,14 +10583,7 @@
           <w:rFonts w:cs="Carlito"/>
           <w:sz w:val="20"/>
         </w:rPr>
-        <w:t>Pesan galat selalu menyebut tiga hal: apa yang salah, di berkas mana, dan baris berapa. Bacalah dari baris pertama — sisa pesannya hanya menjela</w:t>
-      </w:r>
-      <w:r>
-        <w:rPr>
-          <w:rFonts w:cs="Carlito"/>
-          <w:sz w:val="20"/>
-        </w:rPr>
-        <w:t>skan perjalanan menuju baris itu.</w:t>
+        <w:t>Pesan galat selalu menyebut tiga hal: apa yang salah, di berkas mana, dan baris berapa. Bacalah dari baris pertama — sisa pesannya hanya menjelaskan perjalanan menuju baris itu.</w:t>
       </w:r>
     </w:p>
     <w:tbl>
@@ -11287,15 +11004,7 @@
           <w:b/>
           <w:color w:val="003796"/>
         </w:rPr>
-        <w:t>E.2  Menjalankan halaman lewat server lokal, buka</w:t>
-      </w:r>
-      <w:r>
-        <w:rPr>
-          <w:rFonts w:cs="Carlito"/>
-          <w:b/>
-          <w:color w:val="003796"/>
-        </w:rPr>
-        <w:t>n file://</w:t>
+        <w:t>E.2  Menjalankan halaman lewat server lokal, bukan file://</w:t>
       </w:r>
     </w:p>
     <w:p>
@@ -11347,16 +11056,7 @@
                 <w:color w:val="FFFFFF"/>
                 <w:sz w:val="18"/>
               </w:rPr>
-              <w:t>G</w:t>
-            </w:r>
-            <w:r>
-              <w:rPr>
-                <w:rFonts w:cs="Carlito"/>
-                <w:b/>
-                <w:color w:val="FFFFFF"/>
-                <w:sz w:val="18"/>
-              </w:rPr>
-              <w:t>ejala di Console</w:t>
+              <w:t>Gejala di Console</w:t>
             </w:r>
           </w:p>
         </w:tc>
@@ -11636,14 +11336,7 @@
                 <w:rFonts w:cs="Carlito"/>
                 <w:sz w:val="18"/>
               </w:rPr>
-              <w:t>Pastikan src menunjuk app.js, bukan profil</w:t>
-            </w:r>
-            <w:r>
-              <w:rPr>
-                <w:rFonts w:cs="Carlito"/>
-                <w:sz w:val="18"/>
-              </w:rPr>
-              <w:t>.html</w:t>
+              <w:t>Pastikan src menunjuk app.js, bukan profil.html</w:t>
             </w:r>
           </w:p>
         </w:tc>
@@ -11799,14 +11492,7 @@
                 <w:rFonts w:cs="Carlito"/>
                 <w:sz w:val="18"/>
               </w:rPr>
-              <w:t>Klik nom</w:t>
-            </w:r>
-            <w:r>
-              <w:rPr>
-                <w:rFonts w:cs="Carlito"/>
-                <w:sz w:val="18"/>
-              </w:rPr>
-              <w:t>or baris</w:t>
+              <w:t>Klik nomor baris</w:t>
             </w:r>
           </w:p>
         </w:tc>
@@ -12601,21 +12287,37 @@
                 <w:color w:val="1F3A68"/>
                 <w:sz w:val="18"/>
               </w:rPr>
-              <w:t xml:space="preserve">Access to script at </w:t>
-            </w:r>
+              <w:t>Access to script at '.../js/app.js' from origin 'null' has been blocked by CORS policy: Cross origin requests are only supported for protocol schemes: chrome, chrome-extension, ..., http, https</w:t>
+            </w:r>
+          </w:p>
+        </w:tc>
+        <w:tc>
+          <w:tcPr>
+            <w:tcW w:w="1200" w:type="dxa"/>
+            <w:tcBorders>
+              <w:top w:val="single" w:sz="6" w:space="0" w:color="D8DEE9"/>
+              <w:left w:val="single" w:sz="6" w:space="0" w:color="D8DEE9"/>
+              <w:bottom w:val="single" w:sz="6" w:space="0" w:color="D8DEE9"/>
+              <w:right w:val="single" w:sz="6" w:space="0" w:color="D8DEE9"/>
+            </w:tcBorders>
+          </w:tcPr>
+          <w:p>
+            <w:pPr>
+              <w:spacing w:before="20" w:after="20" w:line="252" w:lineRule="auto"/>
+            </w:pPr>
             <w:r>
               <w:rPr>
                 <w:rFonts w:cs="Carlito"/>
                 <w:color w:val="1F3A68"/>
                 <w:sz w:val="18"/>
               </w:rPr>
-              <w:t>'.../js/app.js' from origin 'null' has been blocked by CORS policy: Cross origin requests are only supported for protocol schemes: chrome, chrome-extension, ..., http, https</w:t>
-            </w:r>
-          </w:p>
-        </w:tc>
-        <w:tc>
-          <w:tcPr>
-            <w:tcW w:w="1200" w:type="dxa"/>
+              <w:t>profil.html baris 117 (tag script)</w:t>
+            </w:r>
+          </w:p>
+        </w:tc>
+        <w:tc>
+          <w:tcPr>
+            <w:tcW w:w="2600" w:type="dxa"/>
             <w:tcBorders>
               <w:top w:val="single" w:sz="6" w:space="0" w:color="D8DEE9"/>
               <w:left w:val="single" w:sz="6" w:space="0" w:color="D8DEE9"/>
@@ -12633,39 +12335,7 @@
                 <w:color w:val="1F3A68"/>
                 <w:sz w:val="18"/>
               </w:rPr>
-              <w:t>profil.html baris 117 (tag script)</w:t>
-            </w:r>
-          </w:p>
-        </w:tc>
-        <w:tc>
-          <w:tcPr>
-            <w:tcW w:w="2600" w:type="dxa"/>
-            <w:tcBorders>
-              <w:top w:val="single" w:sz="6" w:space="0" w:color="D8DEE9"/>
-              <w:left w:val="single" w:sz="6" w:space="0" w:color="D8DEE9"/>
-              <w:bottom w:val="single" w:sz="6" w:space="0" w:color="D8DEE9"/>
-              <w:right w:val="single" w:sz="6" w:space="0" w:color="D8DEE9"/>
-            </w:tcBorders>
-          </w:tcPr>
-          <w:p>
-            <w:pPr>
-              <w:spacing w:before="20" w:after="20" w:line="252" w:lineRule="auto"/>
-            </w:pPr>
-            <w:r>
-              <w:rPr>
-                <w:rFonts w:cs="Carlito"/>
-                <w:color w:val="1F3A68"/>
-                <w:sz w:val="18"/>
-              </w:rPr>
-              <w:t>Halaman dibuka lewat file:// (klik dua kali, al</w:t>
-            </w:r>
-            <w:r>
-              <w:rPr>
-                <w:rFonts w:cs="Carlito"/>
-                <w:color w:val="1F3A68"/>
-                <w:sz w:val="18"/>
-              </w:rPr>
-              <w:t>amat C:/...), sehingga peramban menolak memuat modul. Halaman hanya menampilkan "Memuat..." tanpa isi.</w:t>
+              <w:t>Halaman dibuka lewat file:// (klik dua kali, alamat C:/...), sehingga peramban menolak memuat modul. Halaman hanya menampilkan "Memuat..." tanpa isi.</w:t>
             </w:r>
           </w:p>
         </w:tc>
@@ -12720,21 +12390,37 @@
                 <w:color w:val="1F3A68"/>
                 <w:sz w:val="18"/>
               </w:rPr>
-              <w:t>Uncaught TypeError:</w:t>
-            </w:r>
+              <w:t>Uncaught TypeError: Cannot set properties of null (setting 'innerHTML')</w:t>
+            </w:r>
+          </w:p>
+        </w:tc>
+        <w:tc>
+          <w:tcPr>
+            <w:tcW w:w="1200" w:type="dxa"/>
+            <w:tcBorders>
+              <w:top w:val="single" w:sz="6" w:space="0" w:color="D8DEE9"/>
+              <w:left w:val="single" w:sz="6" w:space="0" w:color="D8DEE9"/>
+              <w:bottom w:val="single" w:sz="6" w:space="0" w:color="D8DEE9"/>
+              <w:right w:val="single" w:sz="6" w:space="0" w:color="D8DEE9"/>
+            </w:tcBorders>
+          </w:tcPr>
+          <w:p>
+            <w:pPr>
+              <w:spacing w:before="20" w:after="20" w:line="252" w:lineRule="auto"/>
+            </w:pPr>
             <w:r>
               <w:rPr>
                 <w:rFonts w:cs="Carlito"/>
                 <w:color w:val="1F3A68"/>
                 <w:sz w:val="18"/>
               </w:rPr>
-              <w:t xml:space="preserve"> Cannot set properties of null (setting 'innerHTML')</w:t>
-            </w:r>
-          </w:p>
-        </w:tc>
-        <w:tc>
-          <w:tcPr>
-            <w:tcW w:w="1200" w:type="dxa"/>
+              <w:t>app.js baris 112 (elemen.innerHTML = html)</w:t>
+            </w:r>
+          </w:p>
+        </w:tc>
+        <w:tc>
+          <w:tcPr>
+            <w:tcW w:w="2600" w:type="dxa"/>
             <w:tcBorders>
               <w:top w:val="single" w:sz="6" w:space="0" w:color="D8DEE9"/>
               <w:left w:val="single" w:sz="6" w:space="0" w:color="D8DEE9"/>
@@ -12752,13 +12438,13 @@
                 <w:color w:val="1F3A68"/>
                 <w:sz w:val="18"/>
               </w:rPr>
-              <w:t>app.js baris 112 (elemen.innerHTML = html)</w:t>
-            </w:r>
-          </w:p>
-        </w:tc>
-        <w:tc>
-          <w:tcPr>
-            <w:tcW w:w="2600" w:type="dxa"/>
+              <w:t>Selector "#isi-galeria" salah ketik (id di HTML: isi-galeri), jadi querySelector mengembalikan null. Galat ini sengaja dipicu saat uji.</w:t>
+            </w:r>
+          </w:p>
+        </w:tc>
+        <w:tc>
+          <w:tcPr>
+            <w:tcW w:w="2551" w:type="dxa"/>
             <w:tcBorders>
               <w:top w:val="single" w:sz="6" w:space="0" w:color="D8DEE9"/>
               <w:left w:val="single" w:sz="6" w:space="0" w:color="D8DEE9"/>
@@ -12776,39 +12462,7 @@
                 <w:color w:val="1F3A68"/>
                 <w:sz w:val="18"/>
               </w:rPr>
-              <w:t>Selector "#isi-galeria" salah ketik (id di HTML: isi-galeri), jadi querySelector mengembalikan null. Galat ini sengaja dipicu saat uji.</w:t>
-            </w:r>
-          </w:p>
-        </w:tc>
-        <w:tc>
-          <w:tcPr>
-            <w:tcW w:w="2551" w:type="dxa"/>
-            <w:tcBorders>
-              <w:top w:val="single" w:sz="6" w:space="0" w:color="D8DEE9"/>
-              <w:left w:val="single" w:sz="6" w:space="0" w:color="D8DEE9"/>
-              <w:bottom w:val="single" w:sz="6" w:space="0" w:color="D8DEE9"/>
-              <w:right w:val="single" w:sz="6" w:space="0" w:color="D8DEE9"/>
-            </w:tcBorders>
-          </w:tcPr>
-          <w:p>
-            <w:pPr>
-              <w:spacing w:before="20" w:after="20" w:line="252" w:lineRule="auto"/>
-            </w:pPr>
-            <w:r>
-              <w:rPr>
-                <w:rFonts w:cs="Carlito"/>
-                <w:color w:val="1F3A68"/>
-                <w:sz w:val="18"/>
-              </w:rPr>
-              <w:t>Mengembalikan selector m</w:t>
-            </w:r>
-            <w:r>
-              <w:rPr>
-                <w:rFonts w:cs="Carlito"/>
-                <w:color w:val="1F3A68"/>
-                <w:sz w:val="18"/>
-              </w:rPr>
-              <w:t>enjadi "#isi-galeri", lalu memuat ulang. Console bersih.</w:t>
+              <w:t>Mengembalikan selector menjadi "#isi-galeri", lalu memuat ulang. Console bersih.</w:t>
             </w:r>
           </w:p>
         </w:tc>
@@ -12887,15 +12541,7 @@
                 <w:color w:val="1F3A68"/>
                 <w:sz w:val="18"/>
               </w:rPr>
-              <w:t xml:space="preserve">Label salah ketik: profil.namaa, bukan profil.nama. Label yang tidak ada di </w:t>
-            </w:r>
-            <w:r>
-              <w:rPr>
-                <w:rFonts w:cs="Carlito"/>
-                <w:color w:val="1F3A68"/>
-                <w:sz w:val="18"/>
-              </w:rPr>
-              <w:t>objek menghasilkan undefined, bukan galat. Diuji terpisah dengan Node.</w:t>
+              <w:t>Label salah ketik: profil.namaa, bukan profil.nama. Label yang tidak ada di objek menghasilkan undefined, bukan galat. Diuji terpisah dengan Node.</w:t>
             </w:r>
           </w:p>
         </w:tc>
@@ -12962,16 +12608,7 @@
                 <w:color w:val="8A5A00"/>
                 <w:sz w:val="20"/>
               </w:rPr>
-              <w:t xml:space="preserve">Simpan tiga tangkapan layar Console: satu saat galat muncul, satu setelah diperbaiki, satu </w:t>
-            </w:r>
-            <w:r>
-              <w:rPr>
-                <w:rFonts w:cs="Carlito"/>
-                <w:b/>
-                <w:color w:val="8A5A00"/>
-                <w:sz w:val="20"/>
-              </w:rPr>
-              <w:t>saat data tampil sebagai tabel.  Ketiganya Anda perlukan di lembar F.</w:t>
+              <w:t>Simpan tiga tangkapan layar Console: satu saat galat muncul, satu setelah diperbaiki, satu saat data tampil sebagai tabel.  Ketiganya Anda perlukan di lembar F.</w:t>
             </w:r>
           </w:p>
         </w:tc>
@@ -13159,33 +12796,7 @@
           <w:color w:val="555555"/>
           <w:sz w:val="17"/>
         </w:rPr>
-        <w:t xml:space="preserve">Tangkapan 3 — data tampil sebagai tabel </w:t>
-      </w:r>
-      <w:r>
-        <w:rPr>
-          <w:i/>
-          <w:color w:val="555555"/>
-          <w:sz w:val="17"/>
-        </w:rPr>
-        <w:t>(</w:t>
-      </w:r>
-      <w:proofErr w:type="gramStart"/>
-      <w:r>
-        <w:rPr>
-          <w:i/>
-          <w:color w:val="555555"/>
-          <w:sz w:val="17"/>
-        </w:rPr>
-        <w:t>console.table</w:t>
-      </w:r>
-      <w:proofErr w:type="gramEnd"/>
-      <w:r>
-        <w:rPr>
-          <w:i/>
-          <w:color w:val="555555"/>
-          <w:sz w:val="17"/>
-        </w:rPr>
-        <w:t>)</w:t>
+        <w:t>Tangkapan 3 — data tampil sebagai tabel (console.table)</w:t>
       </w:r>
     </w:p>
     <w:p>
@@ -13355,14 +12966,7 @@
           <w:rFonts w:cs="Carlito"/>
           <w:sz w:val="20"/>
         </w:rPr>
-        <w:t>Cara memasti</w:t>
-      </w:r>
-      <w:r>
-        <w:rPr>
-          <w:rFonts w:cs="Carlito"/>
-          <w:sz w:val="20"/>
-        </w:rPr>
-        <w:t>kan: Console Anda bersih, dan tabel di E.5 terisi dengan sebab yang benar — bukan dengan "sudah diperbaiki" saja.</w:t>
+        <w:t>Cara memastikan: Console Anda bersih, dan tabel di E.5 terisi dengan sebab yang benar — bukan dengan "sudah diperbaiki" saja.</w:t>
       </w:r>
     </w:p>
     <w:p>
@@ -13567,14 +13171,7 @@
           <w:rFonts w:cs="Carlito"/>
           <w:sz w:val="20"/>
         </w:rPr>
-        <w:t>1.  Tulis satu potong data di halaman Anda yang sekarang tersimpan sebagai variabel, dan sebutkan nama variabelnya. Apa yang harus And</w:t>
-      </w:r>
-      <w:r>
-        <w:rPr>
-          <w:rFonts w:cs="Carlito"/>
-          <w:sz w:val="20"/>
-        </w:rPr>
-        <w:t>a ubah kalau isinya berubah?</w:t>
+        <w:t>1.  Tulis satu potong data di halaman Anda yang sekarang tersimpan sebagai variabel, dan sebutkan nama variabelnya. Apa yang harus Anda ubah kalau isinya berubah?</w:t>
       </w:r>
     </w:p>
     <w:tbl>
@@ -13973,15 +13570,7 @@
                 <w:sz w:val="22"/>
               </w:rPr>
               <w:lastRenderedPageBreak/>
-              <w:t>☐</w:t>
-            </w:r>
-            <w:r>
-              <w:rPr>
-                <w:rFonts w:cs="Carlito"/>
-                <w:color w:val="003796"/>
-                <w:sz w:val="22"/>
-              </w:rPr>
-              <w:t xml:space="preserve">  Berkas  profil.html dan folder js/ ada di repositori, terbuka tanpa galat di Console</w:t>
+              <w:t>☐  Berkas  profil.html dan folder js/ ada di repositori, terbuka tanpa galat di Console</w:t>
             </w:r>
           </w:p>
         </w:tc>
@@ -14007,15 +13596,7 @@
                 <w:color w:val="003796"/>
                 <w:sz w:val="22"/>
               </w:rPr>
-              <w:t>☑</w:t>
-            </w:r>
-            <w:r>
-              <w:rPr>
-                <w:rFonts w:cs="Carlito"/>
-                <w:color w:val="003796"/>
-                <w:sz w:val="22"/>
-              </w:rPr>
-              <w:t xml:space="preserve">  Skrip  baris &lt;script type="module" src="js/app.js"&gt;&lt;/script&gt; ada sebelum &lt;/body&gt;, tidak ditulis dua kali</w:t>
+              <w:t>☑  Skrip  baris &lt;script type="module" src="js/app.js"&gt;&lt;/script&gt; ada sebelum &lt;/body&gt;, tidak ditulis dua kali</w:t>
             </w:r>
           </w:p>
         </w:tc>
@@ -14041,15 +13622,7 @@
                 <w:color w:val="003796"/>
                 <w:sz w:val="22"/>
               </w:rPr>
-              <w:t>☑</w:t>
-            </w:r>
-            <w:r>
-              <w:rPr>
-                <w:rFonts w:cs="Carlito"/>
-                <w:color w:val="003796"/>
-                <w:sz w:val="22"/>
-              </w:rPr>
-              <w:t xml:space="preserve">  Data  identitas, daftar keahlian, dan daftar proyek tersimpan sebagai const di app.js, tidak ditulis di HTML</w:t>
+              <w:t>☑  Data  identitas, daftar keahlian, dan daftar proyek tersimpan sebagai const di app.js, tidak ditulis di HTML</w:t>
             </w:r>
           </w:p>
         </w:tc>
@@ -14075,23 +13648,7 @@
                 <w:color w:val="003796"/>
                 <w:sz w:val="22"/>
               </w:rPr>
-              <w:t>☑</w:t>
-            </w:r>
-            <w:r>
-              <w:rPr>
-                <w:rFonts w:cs="Carlito"/>
-                <w:color w:val="003796"/>
-                <w:sz w:val="22"/>
-              </w:rPr>
-              <w:t xml:space="preserve">  Fungsi  minimal dua fungsi murn</w:t>
-            </w:r>
-            <w:r>
-              <w:rPr>
-                <w:rFonts w:cs="Carlito"/>
-                <w:color w:val="003796"/>
-                <w:sz w:val="22"/>
-              </w:rPr>
-              <w:t>i bekerja, masing-masing satu pekerjaan, memakai return</w:t>
+              <w:t>☑  Fungsi  minimal dua fungsi murni bekerja, masing-masing satu pekerjaan, memakai return</w:t>
             </w:r>
           </w:p>
         </w:tc>
@@ -14117,15 +13674,7 @@
                 <w:color w:val="003796"/>
                 <w:sz w:val="22"/>
               </w:rPr>
-              <w:t>☑</w:t>
-            </w:r>
-            <w:r>
-              <w:rPr>
-                <w:rFonts w:cs="Carlito"/>
-                <w:color w:val="003796"/>
-                <w:sz w:val="22"/>
-              </w:rPr>
-              <w:t xml:space="preserve">  Array methods  map, filter, dan find dipakai pada data yang benar; data asli tidak berubah setelah salinan diurutkan</w:t>
+              <w:t>☑  Array methods  map, filter, dan find dipakai pada data yang benar; data asli tidak berubah setelah salinan diurutkan</w:t>
             </w:r>
           </w:p>
         </w:tc>
@@ -14151,23 +13700,7 @@
                 <w:color w:val="003796"/>
                 <w:sz w:val="22"/>
               </w:rPr>
-              <w:t>☑</w:t>
-            </w:r>
-            <w:r>
-              <w:rPr>
-                <w:rFonts w:cs="Carlito"/>
-                <w:color w:val="003796"/>
-                <w:sz w:val="22"/>
-              </w:rPr>
-              <w:t xml:space="preserve">  Console  tidak ada pesan merah; tiga tangkapan layar lembar E sudah disimpa</w:t>
-            </w:r>
-            <w:r>
-              <w:rPr>
-                <w:rFonts w:cs="Carlito"/>
-                <w:color w:val="003796"/>
-                <w:sz w:val="22"/>
-              </w:rPr>
-              <w:t>n</w:t>
+              <w:t>☑  Console  tidak ada pesan merah; tiga tangkapan layar lembar E sudah disimpan</w:t>
             </w:r>
           </w:p>
         </w:tc>
@@ -14193,15 +13726,7 @@
                 <w:color w:val="003796"/>
                 <w:sz w:val="22"/>
               </w:rPr>
-              <w:t>☑</w:t>
-            </w:r>
-            <w:r>
-              <w:rPr>
-                <w:rFonts w:cs="Carlito"/>
-                <w:color w:val="003796"/>
-                <w:sz w:val="22"/>
-              </w:rPr>
-              <w:t xml:space="preserve">  Deklarasi AI  bagian README menyebutkan bagian mana yang dibantu AI dan bagian mana yang Anda kerjakan sendiri</w:t>
+              <w:t>☑  Deklarasi AI  bagian README menyebutkan bagian mana yang dibantu AI dan bagian mana yang Anda kerjakan sendiri</w:t>
             </w:r>
           </w:p>
         </w:tc>
@@ -14227,15 +13752,7 @@
                 <w:color w:val="003796"/>
                 <w:sz w:val="22"/>
               </w:rPr>
-              <w:t>☐</w:t>
-            </w:r>
-            <w:r>
-              <w:rPr>
-                <w:rFonts w:cs="Carlito"/>
-                <w:color w:val="003796"/>
-                <w:sz w:val="22"/>
-              </w:rPr>
-              <w:t xml:space="preserve">  Git  ada lebih dari satu commit hari ini, dan pesan commit-nya menjelaskan isinya</w:t>
+              <w:t>☐  Git  ada lebih dari satu commit hari ini, dan pesan commit-nya menjelaskan isinya</w:t>
             </w:r>
           </w:p>
         </w:tc>
@@ -14266,14 +13783,7 @@
           <w:rFonts w:cs="Carlito"/>
           <w:sz w:val="20"/>
         </w:rPr>
-        <w:t xml:space="preserve">Tulis satu kalimat — </w:t>
-      </w:r>
-      <w:r>
-        <w:rPr>
-          <w:rFonts w:cs="Carlito"/>
-          <w:sz w:val="20"/>
-        </w:rPr>
-        <w:t>bukan untuk dosen, untuk Anda sendiri dua pekan dari sekarang — tentang hal yang hari ini paling sering membuat Anda salah.</w:t>
+        <w:t>Tulis satu kalimat — bukan untuk dosen, untuk Anda sendiri dua pekan dari sekarang — tentang hal yang hari ini paling sering membuat Anda salah.</w:t>
       </w:r>
     </w:p>
     <w:tbl>
@@ -14354,14 +13864,7 @@
           <w:rFonts w:cs="Carlito"/>
           <w:sz w:val="20"/>
         </w:rPr>
-        <w:t>Isi perkiraan nilai Anda apa adanya sebelum menyerahkan lembar ini. Penilaian yang jujur membantu Anda mengetahui bagian mana yang belum kokoh. Kolom Bukti diisi nama berkas atau ba</w:t>
-      </w:r>
-      <w:r>
-        <w:rPr>
-          <w:rFonts w:cs="Carlito"/>
-          <w:sz w:val="20"/>
-        </w:rPr>
-        <w:t>ris kode yang bisa dibuka dosen.</w:t>
+        <w:t>Isi perkiraan nilai Anda apa adanya sebelum menyerahkan lembar ini. Penilaian yang jujur membantu Anda mengetahui bagian mana yang belum kokoh. Kolom Bukti diisi nama berkas atau baris kode yang bisa dibuka dosen.</w:t>
       </w:r>
     </w:p>
     <w:tbl>
@@ -14394,15 +13897,7 @@
                 <w:color w:val="003796"/>
                 <w:sz w:val="22"/>
               </w:rPr>
-              <w:t>☑</w:t>
-            </w:r>
-            <w:r>
-              <w:rPr>
-                <w:rFonts w:cs="Carlito"/>
-                <w:color w:val="003796"/>
-                <w:sz w:val="22"/>
-              </w:rPr>
-              <w:t xml:space="preserve">  Pengungkapan AI  README menyebutkan bagian mana yang dibantu AI dan bagian mana yang saya kerjakan sendiri</w:t>
+              <w:t>☑  Pengungkapan AI  README menyebutkan bagian mana yang dibantu AI dan bagian mana yang saya kerjakan sendiri</w:t>
             </w:r>
           </w:p>
         </w:tc>
@@ -14428,15 +13923,7 @@
                 <w:color w:val="003796"/>
                 <w:sz w:val="22"/>
               </w:rPr>
-              <w:t>☐</w:t>
-            </w:r>
-            <w:r>
-              <w:rPr>
-                <w:rFonts w:cs="Carlito"/>
-                <w:color w:val="003796"/>
-                <w:sz w:val="22"/>
-              </w:rPr>
-              <w:t xml:space="preserve">  Keaslian  topik dan isi halaman ini milik saya sendiri, tidak menyalin pekerjaan mahasiswa lain</w:t>
+              <w:t>☐  Keaslian  topik dan isi halaman ini milik saya sendiri, tidak menyalin pekerjaan mahasiswa lain</w:t>
             </w:r>
           </w:p>
         </w:tc>
@@ -14514,16 +14001,7 @@
                 <w:color w:val="FFFFFF"/>
                 <w:sz w:val="18"/>
               </w:rPr>
-              <w:t>Bobo</w:t>
-            </w:r>
-            <w:r>
-              <w:rPr>
-                <w:rFonts w:cs="Carlito"/>
-                <w:b/>
-                <w:color w:val="FFFFFF"/>
-                <w:sz w:val="18"/>
-              </w:rPr>
-              <w:t>t</w:t>
+              <w:t>Bobot</w:t>
             </w:r>
           </w:p>
         </w:tc>
@@ -14777,15 +14255,7 @@
                 <w:color w:val="1F3A68"/>
                 <w:sz w:val="16"/>
               </w:rPr>
-              <w:t xml:space="preserve">buatPerkenalan (baris 41) dan formatKeahlian (baris 46), tiap fungsi satu pekerjaan, </w:t>
-            </w:r>
-            <w:r>
-              <w:rPr>
-                <w:rFonts w:cs="Carlito"/>
-                <w:color w:val="1F3A68"/>
-                <w:sz w:val="16"/>
-              </w:rPr>
-              <w:t>memakai return</w:t>
+              <w:t>buatPerkenalan (baris 41) dan formatKeahlian (baris 46), tiap fungsi satu pekerjaan, memakai return</w:t>
             </w:r>
           </w:p>
         </w:tc>
@@ -14987,15 +14457,7 @@
                 <w:color w:val="1F3A68"/>
                 <w:sz w:val="16"/>
               </w:rPr>
-              <w:t xml:space="preserve">Console bersih; tiga kasus di E.5 dengan sebab; </w:t>
-            </w:r>
-            <w:r>
-              <w:rPr>
-                <w:rFonts w:cs="Carlito"/>
-                <w:color w:val="1F3A68"/>
-                <w:sz w:val="16"/>
-              </w:rPr>
-              <w:t>screenshots/console-1..3.png</w:t>
+              <w:t>Console bersih; tiga kasus di E.5 dengan sebab; screenshots/console-1..3.png</w:t>
             </w:r>
           </w:p>
         </w:tc>
@@ -15285,10 +14747,114 @@
       <w:r>
         <w:rPr>
           <w:rFonts w:cs="Carlito"/>
+          <w:noProof/>
           <w:sz w:val="20"/>
         </w:rPr>
         <w:lastRenderedPageBreak/>
-        <w:t>Yang ingin saya bahas di kelas berikutnya:</w:t>
+        <w:drawing>
+          <wp:anchor distT="0" distB="0" distL="114300" distR="114300" simplePos="0" relativeHeight="251659776" behindDoc="1" locked="0" layoutInCell="1" allowOverlap="1" wp14:anchorId="4A22AD9E" wp14:editId="449F5307">
+            <wp:simplePos x="0" y="0"/>
+            <wp:positionH relativeFrom="column">
+              <wp:posOffset>1128837</wp:posOffset>
+            </wp:positionH>
+            <wp:positionV relativeFrom="paragraph">
+              <wp:posOffset>453031</wp:posOffset>
+            </wp:positionV>
+            <wp:extent cx="652007" cy="965665"/>
+            <wp:effectExtent l="0" t="0" r="0" b="6350"/>
+            <wp:wrapNone/>
+            <wp:docPr id="4" name="Picture 4"/>
+            <wp:cNvGraphicFramePr>
+              <a:graphicFrameLocks xmlns:a="http://schemas.openxmlformats.org/drawingml/2006/main" noChangeAspect="1"/>
+            </wp:cNvGraphicFramePr>
+            <a:graphic xmlns:a="http://schemas.openxmlformats.org/drawingml/2006/main">
+              <a:graphicData uri="http://schemas.openxmlformats.org/drawingml/2006/picture">
+                <pic:pic xmlns:pic="http://schemas.openxmlformats.org/drawingml/2006/picture">
+                  <pic:nvPicPr>
+                    <pic:cNvPr id="4" name="Picture 4"/>
+                    <pic:cNvPicPr/>
+                  </pic:nvPicPr>
+                  <pic:blipFill>
+                    <a:blip r:embed="rId11"/>
+                    <a:stretch>
+                      <a:fillRect/>
+                    </a:stretch>
+                  </pic:blipFill>
+                  <pic:spPr>
+                    <a:xfrm>
+                      <a:off x="0" y="0"/>
+                      <a:ext cx="652007" cy="965665"/>
+                    </a:xfrm>
+                    <a:prstGeom prst="rect">
+                      <a:avLst/>
+                    </a:prstGeom>
+                  </pic:spPr>
+                </pic:pic>
+              </a:graphicData>
+            </a:graphic>
+            <wp14:sizeRelH relativeFrom="page">
+              <wp14:pctWidth>0</wp14:pctWidth>
+            </wp14:sizeRelH>
+            <wp14:sizeRelV relativeFrom="page">
+              <wp14:pctHeight>0</wp14:pctHeight>
+            </wp14:sizeRelV>
+          </wp:anchor>
+        </w:drawing>
+      </w:r>
+      <w:r>
+        <w:rPr>
+          <w:rFonts w:cs="Carlito"/>
+          <w:sz w:val="20"/>
+        </w:rPr>
+        <w:t xml:space="preserve">Yang </w:t>
+      </w:r>
+      <w:proofErr w:type="spellStart"/>
+      <w:r>
+        <w:rPr>
+          <w:rFonts w:cs="Carlito"/>
+          <w:sz w:val="20"/>
+        </w:rPr>
+        <w:t>ingin</w:t>
+      </w:r>
+      <w:proofErr w:type="spellEnd"/>
+      <w:r>
+        <w:rPr>
+          <w:rFonts w:cs="Carlito"/>
+          <w:sz w:val="20"/>
+        </w:rPr>
+        <w:t xml:space="preserve"> </w:t>
+      </w:r>
+      <w:proofErr w:type="spellStart"/>
+      <w:r>
+        <w:rPr>
+          <w:rFonts w:cs="Carlito"/>
+          <w:sz w:val="20"/>
+        </w:rPr>
+        <w:t>saya</w:t>
+      </w:r>
+      <w:proofErr w:type="spellEnd"/>
+      <w:r>
+        <w:rPr>
+          <w:rFonts w:cs="Carlito"/>
+          <w:sz w:val="20"/>
+        </w:rPr>
+        <w:t xml:space="preserve"> </w:t>
+      </w:r>
+      <w:proofErr w:type="spellStart"/>
+      <w:r>
+        <w:rPr>
+          <w:rFonts w:cs="Carlito"/>
+          <w:sz w:val="20"/>
+        </w:rPr>
+        <w:t>bahas</w:t>
+      </w:r>
+      <w:proofErr w:type="spellEnd"/>
+      <w:r>
+        <w:rPr>
+          <w:rFonts w:cs="Carlito"/>
+          <w:sz w:val="20"/>
+        </w:rPr>
+        <w:t xml:space="preserve"> di kelas berikutnya:</w:t>
       </w:r>
     </w:p>
     <w:tbl>
@@ -15355,14 +14921,92 @@
           <w:rFonts w:cs="Carlito"/>
           <w:sz w:val="20"/>
         </w:rPr>
-        <w:t xml:space="preserve">Tanda tangan: </w:t>
+        <w:t xml:space="preserve">Tanda </w:t>
+      </w:r>
+      <w:proofErr w:type="spellStart"/>
+      <w:r>
+        <w:rPr>
+          <w:rFonts w:cs="Carlito"/>
+          <w:sz w:val="20"/>
+        </w:rPr>
+        <w:t>tangan</w:t>
+      </w:r>
+      <w:proofErr w:type="spellEnd"/>
+      <w:r>
+        <w:rPr>
+          <w:rFonts w:cs="Carlito"/>
+          <w:sz w:val="20"/>
+        </w:rPr>
+        <w:t xml:space="preserve">: _____________________________     </w:t>
+      </w:r>
+      <w:proofErr w:type="spellStart"/>
+      <w:r>
+        <w:rPr>
+          <w:rFonts w:cs="Carlito"/>
+          <w:sz w:val="20"/>
+        </w:rPr>
+        <w:t>Tanggal</w:t>
+      </w:r>
+      <w:proofErr w:type="spellEnd"/>
+      <w:r>
+        <w:rPr>
+          <w:rFonts w:cs="Carlito"/>
+          <w:sz w:val="20"/>
+        </w:rPr>
+        <w:t xml:space="preserve">: </w:t>
       </w:r>
       <w:r>
         <w:rPr>
           <w:rFonts w:cs="Carlito"/>
           <w:sz w:val="20"/>
         </w:rPr>
-        <w:t>______________________________     Tanggal: ______________     Jam selesai: __________</w:t>
+        <w:t xml:space="preserve">10 </w:t>
+      </w:r>
+      <w:proofErr w:type="spellStart"/>
+      <w:r>
+        <w:rPr>
+          <w:rFonts w:cs="Carlito"/>
+          <w:sz w:val="20"/>
+        </w:rPr>
+        <w:t>Oktober</w:t>
+      </w:r>
+      <w:proofErr w:type="spellEnd"/>
+      <w:r>
+        <w:rPr>
+          <w:rFonts w:cs="Carlito"/>
+          <w:sz w:val="20"/>
+        </w:rPr>
+        <w:t xml:space="preserve"> 2026</w:t>
+      </w:r>
+      <w:r>
+        <w:rPr>
+          <w:rFonts w:cs="Carlito"/>
+          <w:sz w:val="20"/>
+        </w:rPr>
+        <w:t xml:space="preserve">    Jam </w:t>
+      </w:r>
+      <w:proofErr w:type="spellStart"/>
+      <w:r>
+        <w:rPr>
+          <w:rFonts w:cs="Carlito"/>
+          <w:sz w:val="20"/>
+        </w:rPr>
+        <w:t>selesai</w:t>
+      </w:r>
+      <w:proofErr w:type="spellEnd"/>
+      <w:r>
+        <w:rPr>
+          <w:rFonts w:cs="Carlito"/>
+          <w:sz w:val="20"/>
+        </w:rPr>
+        <w:t xml:space="preserve">: </w:t>
+      </w:r>
+      <w:r>
+        <w:rPr>
+          <w:rFonts w:cs="Carlito"/>
+          <w:sz w:val="20"/>
+        </w:rPr>
+        <w:t>22.30</w:t>
       </w:r>
     </w:p>
     <w:p>
@@ -15537,14 +15181,7 @@
           <w:rFonts w:cs="Carlito"/>
           <w:sz w:val="20"/>
         </w:rPr>
-        <w:t>Cara memasti</w:t>
-      </w:r>
-      <w:r>
-        <w:rPr>
-          <w:rFonts w:cs="Carlito"/>
-          <w:sz w:val="20"/>
-        </w:rPr>
-        <w:t>kan: buka README di repositori Anda. Bagian Pertemuan 8 sudah memuat deklarasi AI, dan commit terakhir adalah commit terbaru.</w:t>
+        <w:t>Cara memastikan: buka README di repositori Anda. Bagian Pertemuan 8 sudah memuat deklarasi AI, dan commit terakhir adalah commit terbaru.</w:t>
       </w:r>
     </w:p>
     <w:p>
@@ -15956,14 +15593,7 @@
                 <w:rFonts w:cs="Carlito"/>
                 <w:sz w:val="17"/>
               </w:rPr>
-              <w:t>Sebagian deklarasi masih memakai var, atau ada satu nilai angka yang tersimpan sebagai tek</w:t>
-            </w:r>
-            <w:r>
-              <w:rPr>
-                <w:rFonts w:cs="Carlito"/>
-                <w:sz w:val="17"/>
-              </w:rPr>
-              <w:t>s</w:t>
+              <w:t>Sebagian deklarasi masih memakai var, atau ada satu nilai angka yang tersimpan sebagai teks</w:t>
             </w:r>
           </w:p>
         </w:tc>
@@ -16108,14 +15738,7 @@
                 <w:rFonts w:cs="Carlito"/>
                 <w:sz w:val="17"/>
               </w:rPr>
-              <w:t>Fungsi tidak</w:t>
-            </w:r>
-            <w:r>
-              <w:rPr>
-                <w:rFonts w:cs="Carlito"/>
-                <w:sz w:val="17"/>
-              </w:rPr>
-              <w:t xml:space="preserve"> mengembalikan nilai, atau seluruh logika ditulis di satu tempat tanpa fungsi</w:t>
+              <w:t>Fungsi tidak mengembalikan nilai, atau seluruh logika ditulis di satu tempat tanpa fungsi</w:t>
             </w:r>
           </w:p>
         </w:tc>
@@ -16214,14 +15837,7 @@
                 <w:rFonts w:cs="Carlito"/>
                 <w:sz w:val="17"/>
               </w:rPr>
-              <w:t xml:space="preserve">Method dipakai tetapi ada yang tidak sesuai kegunaannya — </w:t>
-            </w:r>
-            <w:r>
-              <w:rPr>
-                <w:rFonts w:cs="Carlito"/>
-                <w:sz w:val="17"/>
-              </w:rPr>
-              <w:t>misalnya map untuk menyaring</w:t>
+              <w:t>Method dipakai tetapi ada yang tidak sesuai kegunaannya — misalnya map untuk menyaring</w:t>
             </w:r>
           </w:p>
         </w:tc>
@@ -16343,14 +15959,7 @@
                 <w:rFonts w:cs="Carlito"/>
                 <w:sz w:val="17"/>
               </w:rPr>
-              <w:t>Galat hilang tetapi</w:t>
-            </w:r>
-            <w:r>
-              <w:rPr>
-                <w:rFonts w:cs="Carlito"/>
-                <w:sz w:val="17"/>
-              </w:rPr>
-              <w:t xml:space="preserve"> sebabnya tidak dijelaskan, atau satu kasus belum ditangani</w:t>
+              <w:t>Galat hilang tetapi sebabnya tidak dijelaskan, atau satu kasus belum ditangani</w:t>
             </w:r>
           </w:p>
         </w:tc>
@@ -16495,14 +16104,7 @@
                 <w:rFonts w:cs="Carlito"/>
                 <w:sz w:val="17"/>
               </w:rPr>
-              <w:t>Deklarasi AI kosong, atau pekerjaan tidak tersi</w:t>
-            </w:r>
-            <w:r>
-              <w:rPr>
-                <w:rFonts w:cs="Carlito"/>
-                <w:sz w:val="17"/>
-              </w:rPr>
-              <w:t>mpan di repositori</w:t>
+              <w:t>Deklarasi AI kosong, atau pekerjaan tidak tersimpan di repositori</w:t>
             </w:r>
           </w:p>
         </w:tc>
@@ -16545,16 +16147,7 @@
                 <w:color w:val="003796"/>
                 <w:sz w:val="20"/>
               </w:rPr>
-              <w:t>Yang dinilai adalah pekerjaan Anda sendiri.  Topik yang berbeda antar mahasiswa membuat penilaian tidak bisa dibandingkan antar pekerjaan — karena itu yang diperiksa adalah apakah setiap bagian bekerja sebagaimana dimaksud, bukan apaka</w:t>
-            </w:r>
-            <w:r>
-              <w:rPr>
-                <w:rFonts w:cs="Carlito"/>
-                <w:b/>
-                <w:color w:val="003796"/>
-                <w:sz w:val="20"/>
-              </w:rPr>
-              <w:t>h ia sama dengan contoh.</w:t>
+              <w:t>Yang dinilai adalah pekerjaan Anda sendiri.  Topik yang berbeda antar mahasiswa membuat penilaian tidak bisa dibandingkan antar pekerjaan — karena itu yang diperiksa adalah apakah setiap bagian bekerja sebagaimana dimaksud, bukan apakah ia sama dengan contoh.</w:t>
             </w:r>
           </w:p>
         </w:tc>
@@ -17617,14 +17210,7 @@
                 <w:rFonts w:cs="Carlito"/>
                 <w:sz w:val="18"/>
               </w:rPr>
-              <w:t>Periksa isi app.js dan baris &lt;script&gt; se</w:t>
-            </w:r>
-            <w:r>
-              <w:rPr>
-                <w:rFonts w:cs="Carlito"/>
-                <w:sz w:val="18"/>
-              </w:rPr>
-              <w:t>belum &lt;/body&gt;</w:t>
+              <w:t>Periksa isi app.js dan baris &lt;script&gt; sebelum &lt;/body&gt;</w:t>
             </w:r>
           </w:p>
         </w:tc>
@@ -17852,14 +17438,7 @@
                 <w:rFonts w:cs="Carlito"/>
                 <w:sz w:val="18"/>
               </w:rPr>
-              <w:t>Tambahkan return, atau tulis arrow function satu baris tanpa kuru</w:t>
-            </w:r>
-            <w:r>
-              <w:rPr>
-                <w:rFonts w:cs="Carlito"/>
-                <w:sz w:val="18"/>
-              </w:rPr>
-              <w:t>ng kurawal</w:t>
+              <w:t>Tambahkan return, atau tulis arrow function satu baris tanpa kurung kurawal</w:t>
             </w:r>
           </w:p>
         </w:tc>
@@ -18180,14 +17759,7 @@
           <w:rFonts w:cs="Carlito"/>
           <w:sz w:val="20"/>
         </w:rPr>
-        <w:t>Halaman yang Anda bangun hari ini adalah bahan ujian CPMK Blok 2 nanti: DOM, event, dan pengolahan data semuanya berjalan di atas da</w:t>
-      </w:r>
-      <w:r>
-        <w:rPr>
-          <w:rFonts w:cs="Carlito"/>
-          <w:sz w:val="20"/>
-        </w:rPr>
-        <w:t>ta yang Anda susun di lembar D. Simpan pekerjaan ini rapi di repositori Anda — Anda akan memakainya lagi.</w:t>
+        <w:t>Halaman yang Anda bangun hari ini adalah bahan ujian CPMK Blok 2 nanti: DOM, event, dan pengolahan data semuanya berjalan di atas data yang Anda susun di lembar D. Simpan pekerjaan ini rapi di repositori Anda — Anda akan memakainya lagi.</w:t>
       </w:r>
     </w:p>
     <w:p>
@@ -18626,16 +18198,7 @@
                 <w:color w:val="003796"/>
                 <w:sz w:val="20"/>
               </w:rPr>
-              <w:t>Titik pada git add .  Titik itu berarti "seluruh berkas di folder ini".  Tanpa titik, Git tidak ta</w:t>
-            </w:r>
-            <w:r>
-              <w:rPr>
-                <w:rFonts w:cs="Carlito"/>
-                <w:b/>
-                <w:color w:val="003796"/>
-                <w:sz w:val="20"/>
-              </w:rPr>
-              <w:t>hu apa yang harus disimpan. Hal yang sama berlaku untuk folder js/ yang baru Anda buat — ia ikut tersimpan karena berada di dalam folder semester.</w:t>
+              <w:t>Titik pada git add .  Titik itu berarti "seluruh berkas di folder ini".  Tanpa titik, Git tidak tahu apa yang harus disimpan. Hal yang sama berlaku untuk folder js/ yang baru Anda buat — ia ikut tersimpan karena berada di dalam folder semester.</w:t>
             </w:r>
           </w:p>
         </w:tc>
@@ -18709,16 +18272,7 @@
                 <w:color w:val="FFFFFF"/>
                 <w:sz w:val="19"/>
               </w:rPr>
-              <w:t>Kala</w:t>
-            </w:r>
-            <w:r>
-              <w:rPr>
-                <w:rFonts w:cs="Carlito"/>
-                <w:b/>
-                <w:color w:val="FFFFFF"/>
-                <w:sz w:val="19"/>
-              </w:rPr>
-              <w:t>u ini terjadi</w:t>
+              <w:t>Kalau ini terjadi</w:t>
             </w:r>
           </w:p>
         </w:tc>
@@ -18963,7 +18517,7 @@
       </w:pPr>
     </w:p>
     <w:sectPr>
-      <w:footerReference w:type="default" r:id="rId11"/>
+      <w:footerReference w:type="default" r:id="rId12"/>
       <w:pgSz w:w="11906" w:h="16838"/>
       <w:pgMar w:top="964" w:right="1077" w:bottom="907" w:left="1077" w:header="720" w:footer="720" w:gutter="0"/>
       <w:cols w:space="720"/>
@@ -19011,15 +18565,7 @@
         <w:color w:val="5A6080"/>
         <w:sz w:val="15"/>
       </w:rPr>
-      <w:t xml:space="preserve">PABW </w:t>
-    </w:r>
-    <w:r>
-      <w:rPr>
-        <w:rFonts w:cs="Carlito"/>
-        <w:color w:val="5A6080"/>
-        <w:sz w:val="15"/>
-      </w:rPr>
-      <w:t>2026/2027  ·  Pertemuan 8  ·  JavaScript Modern ES6+  ·  Universitas Islam Indonesia  ·  halaman</w:t>
+      <w:t>PABW 2026/2027  ·  Pertemuan 8  ·  JavaScript Modern ES6+  ·  Universitas Islam Indonesia  ·  halaman</w:t>
     </w:r>
     <w:r>
       <w:fldChar w:fldCharType="begin"/>

</xml_diff>